<commit_message>
docs(learning): redraw IIO position diagram (bigger text, 4x) for readability
Co-Authored-By: Claude Opus 4.8 (1M context) <noreply@anthropic.com>
</commit_message>
<xml_diff>
--- a/docs/learning/12-IIO软件框架详解.docx
+++ b/docs/learning/12-IIO软件框架详解.docx
@@ -72,7 +72,7 @@
       <w:r>
         <w:drawing>
           <wp:inline distT="0" distB="0" distL="0" distR="0">
-            <wp:extent cx="5486400" cy="4282068"/>
+            <wp:extent cx="5486400" cy="3572539"/>
             <wp:docPr id="101" name="fig_iio_pos.png"/>
             <a:graphic>
               <a:graphicData uri="http://schemas.openxmlformats.org/drawingml/2006/picture">
@@ -90,7 +90,7 @@
                   <pic:spPr>
                     <a:xfrm>
                       <a:off x="0" y="0"/>
-                      <a:ext cx="5486400" cy="4282068"/>
+                      <a:ext cx="5486400" cy="3572539"/>
                     </a:xfrm>
                     <a:prstGeom prst="rect">
                       <a:avLst/>

</xml_diff>